<commit_message>
docs(md2docx): consolidate guide and proposal template
Preserve the received guide and template changes, correcting the example output extension to .docx. Validation: 10 postprocessing unittest cases pass; template ZIP integrity and XML parsing pass. Visual template layout has not been reviewed.
</commit_message>
<xml_diff>
--- a/03_Personal/Consolidacion_Markdown_DOCX/assets/templates/plantilla_oferta.docx
+++ b/03_Personal/Consolidacion_Markdown_DOCX/assets/templates/plantilla_oferta.docx
@@ -548,6 +548,168 @@
     <w:p>
       <w:pPr>
         <w:rPr>
+          <w:lang w:val="pt-BR"/>
+        </w:rPr>
+        <w:sectPr>
+          <w:headerReference w:type="even" r:id="rId9"/>
+          <w:headerReference w:type="default" r:id="rId10"/>
+          <w:footerReference w:type="even" r:id="rId11"/>
+          <w:footerReference w:type="default" r:id="rId12"/>
+          <w:headerReference w:type="first" r:id="rId13"/>
+          <w:footerReference w:type="first" r:id="rId14"/>
+          <w:pgSz w:w="12240" w:h="15840"/>
+          <w:pgMar w:top="1440" w:right="1800" w:bottom="1440" w:left="1800" w:header="720" w:footer="720" w:gutter="0"/>
+          <w:pgNumType w:chapStyle="1"/>
+          <w:cols w:space="720"/>
+          <w:docGrid w:linePitch="360"/>
+        </w:sectPr>
+      </w:pPr>
+    </w:p>
+    <w:p>
+      <w:pPr>
+        <w:rPr>
+          <w:lang w:val="pt-BR"/>
+        </w:rPr>
+      </w:pPr>
+    </w:p>
+    <w:p>
+      <w:pPr>
+        <w:rPr>
+          <w:lang w:val="pt-BR"/>
+        </w:rPr>
+      </w:pPr>
+    </w:p>
+    <w:p>
+      <w:pPr>
+        <w:rPr>
+          <w:lang w:val="pt-BR"/>
+        </w:rPr>
+      </w:pPr>
+    </w:p>
+    <w:p>
+      <w:pPr>
+        <w:rPr>
+          <w:lang w:val="pt-BR"/>
+        </w:rPr>
+        <w:sectPr>
+          <w:pgSz w:w="12240" w:h="15840"/>
+          <w:pgMar w:top="1440" w:right="1800" w:bottom="1440" w:left="1800" w:header="720" w:footer="720" w:gutter="0"/>
+          <w:pgNumType w:chapStyle="1"/>
+          <w:cols w:space="720"/>
+          <w:docGrid w:linePitch="360"/>
+        </w:sectPr>
+      </w:pPr>
+    </w:p>
+    <w:p>
+      <w:pPr>
+        <w:rPr>
+          <w:rStyle w:val="DocumentationTok"/>
+          <w:rFonts w:ascii="Sofia Sans" w:hAnsi="Sofia Sans"/>
+          <w:b w:val="0"/>
+          <w:bCs w:val="0"/>
+          <w:i w:val="0"/>
+          <w:color w:val="auto"/>
+          <w:sz w:val="22"/>
+          <w:szCs w:val="24"/>
+          <w:lang w:val="pt-BR"/>
+        </w:rPr>
+      </w:pPr>
+      <w:bookmarkStart w:id="0" w:name="_Hlk236759784"/>
+      <w:r>
+        <w:rPr>
+          <w:lang w:val="pt-BR"/>
+        </w:rPr>
+        <w:lastRenderedPageBreak/>
+        <w:t>Por</w:t>
+      </w:r>
+      <w:r>
+        <w:rPr>
+          <w:lang w:val="pt-BR"/>
+        </w:rPr>
+        <w:t xml:space="preserve"> </w:t>
+      </w:r>
+      <w:proofErr w:type="spellStart"/>
+      <w:r>
+        <w:rPr>
+          <w:lang w:val="pt-BR"/>
+        </w:rPr>
+        <w:t>Convercus</w:t>
+      </w:r>
+      <w:proofErr w:type="spellEnd"/>
+      <w:r>
+        <w:rPr>
+          <w:lang w:val="pt-BR"/>
+        </w:rPr>
+        <w:t xml:space="preserve"> GmbH</w:t>
+      </w:r>
+    </w:p>
+    <w:p>
+      <w:pPr>
+        <w:rPr>
+          <w:lang w:val="de-DE"/>
+        </w:rPr>
+      </w:pPr>
+    </w:p>
+    <w:p>
+      <w:pPr>
+        <w:rPr>
+          <w:rStyle w:val="DocumentationTok"/>
+          <w:rFonts w:ascii="Sofia Sans" w:hAnsi="Sofia Sans"/>
+          <w:b w:val="0"/>
+          <w:bCs w:val="0"/>
+          <w:i w:val="0"/>
+          <w:color w:val="auto"/>
+          <w:sz w:val="22"/>
+          <w:szCs w:val="24"/>
+          <w:lang w:val="pt-BR"/>
+        </w:rPr>
+      </w:pPr>
+      <w:r>
+        <w:rPr>
+          <w:lang w:val="pt-BR"/>
+        </w:rPr>
+        <w:t>__________________________</w:t>
+      </w:r>
+      <w:r>
+        <w:rPr>
+          <w:lang w:val="pt-BR"/>
+        </w:rPr>
+        <w:br/>
+        <w:t xml:space="preserve">Dominic </w:t>
+      </w:r>
+      <w:proofErr w:type="spellStart"/>
+      <w:r>
+        <w:rPr>
+          <w:lang w:val="pt-BR"/>
+        </w:rPr>
+        <w:t>Spindler</w:t>
+      </w:r>
+      <w:proofErr w:type="spellEnd"/>
+      <w:r>
+        <w:rPr>
+          <w:lang w:val="pt-BR"/>
+        </w:rPr>
+        <w:br/>
+        <w:t xml:space="preserve">CEO | </w:t>
+      </w:r>
+      <w:proofErr w:type="spellStart"/>
+      <w:r>
+        <w:rPr>
+          <w:lang w:val="pt-BR"/>
+        </w:rPr>
+        <w:t>Convercus</w:t>
+      </w:r>
+      <w:proofErr w:type="spellEnd"/>
+      <w:r>
+        <w:rPr>
+          <w:lang w:val="pt-BR"/>
+        </w:rPr>
+        <w:t xml:space="preserve"> GmbH</w:t>
+      </w:r>
+    </w:p>
+    <w:p>
+      <w:pPr>
+        <w:rPr>
           <w:rStyle w:val="DocumentationTok"/>
           <w:rFonts w:ascii="Sofia Sans" w:hAnsi="Sofia Sans"/>
           <w:b w:val="0"/>
@@ -559,7 +721,71 @@
         </w:rPr>
       </w:pPr>
       <w:r>
-        <w:lastRenderedPageBreak/>
+        <w:br/>
+      </w:r>
+      <w:r>
+        <w:t>Por</w:t>
+      </w:r>
+      <w:r>
+        <w:t xml:space="preserve"> </w:t>
+      </w:r>
+      <w:r>
+        <w:t>Cliente,</w:t>
+      </w:r>
+    </w:p>
+    <w:p>
+      <w:pPr>
+        <w:rPr>
+          <w:lang w:val="de-DE"/>
+        </w:rPr>
+      </w:pPr>
+    </w:p>
+    <w:p>
+      <w:r>
+        <w:t>__________________________</w:t>
+      </w:r>
+      <w:r>
+        <w:br/>
+      </w:r>
+      <w:r>
+        <w:t xml:space="preserve">Nombre </w:t>
+      </w:r>
+    </w:p>
+    <w:p>
+      <w:pPr>
+        <w:rPr>
+          <w:rStyle w:val="DocumentationTok"/>
+          <w:rFonts w:ascii="Sofia Sans" w:hAnsi="Sofia Sans"/>
+          <w:b w:val="0"/>
+          <w:bCs w:val="0"/>
+          <w:i w:val="0"/>
+          <w:color w:val="auto"/>
+          <w:sz w:val="22"/>
+          <w:szCs w:val="24"/>
+        </w:rPr>
+      </w:pPr>
+      <w:r>
+        <w:t>C</w:t>
+      </w:r>
+      <w:r>
+        <w:t>argo</w:t>
+      </w:r>
+    </w:p>
+    <w:bookmarkEnd w:id="0"/>
+    <w:p>
+      <w:pPr>
+        <w:rPr>
+          <w:rStyle w:val="DocumentationTok"/>
+          <w:rFonts w:ascii="Sofia Sans" w:hAnsi="Sofia Sans"/>
+          <w:b w:val="0"/>
+          <w:bCs w:val="0"/>
+          <w:i w:val="0"/>
+          <w:color w:val="auto"/>
+          <w:sz w:val="22"/>
+          <w:szCs w:val="24"/>
+        </w:rPr>
+      </w:pPr>
+      <w:r>
         <w:fldChar w:fldCharType="begin"/>
       </w:r>
       <w:r>
@@ -573,12 +799,6 @@
       </w:r>
     </w:p>
     <w:sectPr>
-      <w:headerReference w:type="even" r:id="rId9"/>
-      <w:headerReference w:type="default" r:id="rId10"/>
-      <w:footerReference w:type="even" r:id="rId11"/>
-      <w:footerReference w:type="default" r:id="rId12"/>
-      <w:headerReference w:type="first" r:id="rId13"/>
-      <w:footerReference w:type="first" r:id="rId14"/>
       <w:pgSz w:w="12240" w:h="15840"/>
       <w:pgMar w:top="1440" w:right="1800" w:bottom="1440" w:left="1800" w:header="720" w:footer="720" w:gutter="0"/>
       <w:pgNumType w:chapStyle="1"/>
@@ -2837,7 +3057,6 @@
   <w:style w:type="character" w:default="1" w:styleId="Fuentedeprrafopredeter">
     <w:name w:val="Default Paragraph Font"/>
     <w:uiPriority w:val="1"/>
-    <w:semiHidden/>
     <w:unhideWhenUsed/>
   </w:style>
   <w:style w:type="table" w:default="1" w:styleId="Tablanormal">

</xml_diff>